<commit_message>
Tighten Principal-positioning resume to a clean 2 pages
Cut ~3 pages (sparse page 3) down to a full 2. Best-practice trims:
- Summary halved (9 sentences -> 4); dropped the identity flourish and
  the slash-commands detail (already in Skills)
- Resolved the Selected Outcomes / Experience verbatim redundancy: UKG
  Experience cut from 5 full-length bullets to 3 compressed ones;
  ARR-risk model + analytics product folded into one data-products
  bullet since both are detailed in Selected Outcomes
- Sprint instrumentation cut (operationally narrow for Principal
  positioning); cross-functional point moved to the UKG footer
- Skills trimmed ~20% per cluster, keyword-bearing items kept

Verified: parse structure checked, rendered PDF read end to end —
2 pages, no empty section header, all sections render correctly.

https://claude.ai/code/session_017dM7V2VFD2VHNDNWBmpDHh
</commit_message>
<xml_diff>
--- a/applications/Ian_Cowpar_Resume_Principal_Positioning.docx
+++ b/applications/Ian_Cowpar_Resume_Principal_Positioning.docx
@@ -66,7 +66,7 @@
           <w:b w:val="0"/>
           <w:i w:val="0"/>
         </w:rPr>
-        <w:t>Product leader operating at principal scope inside AI-first SaaS. Builds the internal platforms product teams depend on, ships the working prototype in Claude Code rather than handing the spec over a wall, and measures whether behavior actually changed rather than whether the dashboard moved. Two years owning product across a $250M ARR enterprise platform serving 300 customers, including the organization's first organized AI capability layer (built from zero, scaled across the PM org without top-down mandate) and a zero-to-one self-serve product taken from concept to production in a one-week prototype cycle. A decade prior at Broadridge in compliance-grade financial services, where client confidentiality and regulatory consequence were the operating environment, not a footnote. Maintains twenty custom slash commands and a personal Claude Code productivity OS in active daily use. Originator of the Zero-Translation Building framework with weekly published thought leadership on AI adoption realism.</w:t>
+        <w:t>Product leader operating at principal scope inside AI-first SaaS. Two years owning product across a $250M ARR enterprise platform serving 300 customers at UKG, including the organization's first organized AI capability layer (built from zero, no top-down mandate) and a zero-to-one product taken from concept to production in a week. A decade prior at Broadridge in compliance-grade financial services, where client confidentiality and regulatory consequence were the operating environment. Originator of the Zero-Translation Building framework, with weekly published thought leadership on AI adoption realism.</w:t>
       </w:r>
     </w:p>
     <w:p>
@@ -103,7 +103,7 @@
           <w:b w:val="0"/>
           <w:i w:val="0"/>
         </w:rPr>
-        <w:t>Scaled shared infrastructure across 20 PMs with sustained voluntary creation: multiple PMs built their own custom slash commands that replaced manual workflows entirely (the deepest adoption signal, observed in practice). No top-down mandate behind the program.</w:t>
+        <w:t>Scaled shared infrastructure across 20 PMs with no top-down mandate, to the point that multiple PMs built their own custom slash commands and retired manual workflows entirely. Adoption measured by what stopped, not what launched.</w:t>
       </w:r>
     </w:p>
     <w:p>
@@ -126,7 +126,7 @@
           <w:b w:val="0"/>
           <w:i w:val="0"/>
         </w:rPr>
-        <w:t>Projected ~30% time reduction in the underlying enterprise workflow and removed engineering from the critical path of a previously ticket-gated process. Wrote the working prototype in Claude Code, partnered with the platform architect to scope across three business epics, delivered an engineering-ready package the architect built directly against.</w:t>
+        <w:t>Projected ~30% time reduction in a ticket-gated enterprise workflow. Wrote the prototype in Claude Code, scoped three business epics with the platform architect, delivered an engineering-ready package the architect built directly against.</w:t>
       </w:r>
     </w:p>
     <w:p>
@@ -149,7 +149,7 @@
           <w:b w:val="0"/>
           <w:i w:val="0"/>
         </w:rPr>
-        <w:t>through a composite risk model scoring the top accounts on exposure, case volume, true-defect rate, and Salesforce sentiment. Replaced raw ticket counts with weighted signal, defined the success metric, automated the weekly reporting cadence the program lead acted on.</w:t>
+        <w:t>through a composite risk model scoring top accounts on exposure, case volume, true-defect rate, and sentiment, replacing raw ticket counts with weighted signal and an automated weekly cadence the program lead acted on.</w:t>
       </w:r>
     </w:p>
     <w:p>
@@ -164,7 +164,7 @@
           <w:b/>
           <w:i w:val="0"/>
         </w:rPr>
-        <w:t xml:space="preserve">Cut a working defect list from ~200 issues to 5 (~97% reduction) </w:t>
+        <w:t xml:space="preserve">Cut a working defect list from ~200 issues to 5 (~97%) </w:t>
       </w:r>
       <w:r>
         <w:rPr>
@@ -172,7 +172,7 @@
           <w:b w:val="0"/>
           <w:i w:val="0"/>
         </w:rPr>
-        <w:t>through an opinionated operational analytics product with a Claude Code function embedded as a first-class feature. Classified open issues across five panels (escalations, defects, internal bugs, CVEs, noise) across four products and routed the single highest-leverage action per panel so engineering acted on signal, not noise.</w:t>
+        <w:t>with an opinionated analytics product, embedding a Claude Code function that routed the single highest-leverage action across five issue panels and four products.</w:t>
       </w:r>
     </w:p>
     <w:p>
@@ -195,7 +195,7 @@
           <w:b w:val="0"/>
           <w:i w:val="0"/>
         </w:rPr>
-        <w:t>in executive escalation rooms for a $250M ARR platform serving 300 enterprise customers. Synthesized real customer signal against committed roadmap and translated that into tradeoff decisions across four product lines.</w:t>
+        <w:t>, translating customer signal from executive escalation rooms into tradeoff decisions across four product lines on a $250M ARR platform serving 300 customers.</w:t>
       </w:r>
     </w:p>
     <w:p>
@@ -243,7 +243,7 @@
           <w:b w:val="0"/>
           <w:i/>
         </w:rPr>
-        <w:t>Principal-scope product ownership across AI capability, zero-to-one builds, and opinionated data products serving 300 enterprise customers on a $250M ARR platform.</w:t>
+        <w:t>Principal-scope product ownership across AI capability, zero-to-one builds, and data products serving 300 enterprise customers on a $250M ARR platform.</w:t>
       </w:r>
     </w:p>
     <w:p>
@@ -258,7 +258,7 @@
           <w:b/>
           <w:i w:val="0"/>
         </w:rPr>
-        <w:t xml:space="preserve">Built the AI capability platform from zero across 20 PMs </w:t>
+        <w:t xml:space="preserve">Built the organization's first AI capability platform from zero </w:t>
       </w:r>
       <w:r>
         <w:rPr>
@@ -266,7 +266,7 @@
           <w:b w:val="0"/>
           <w:i w:val="0"/>
         </w:rPr>
-        <w:t>, scaling shared infrastructure with sustained voluntary creation; coached individual PMs into role-specific use cases until multiple were replacing manual workflows with their own custom slash commands. Behavior extinction, not addition. No top-down mandate.</w:t>
+        <w:t>, scaling it across 20 PMs without mandate and coaching individual PMs until they retired manual workflows for their own slash commands.</w:t>
       </w:r>
     </w:p>
     <w:p>
@@ -289,7 +289,7 @@
           <w:b w:val="0"/>
           <w:i w:val="0"/>
         </w:rPr>
-        <w:t>, projected to deliver ~30% time reduction in a ticket-gated enterprise workflow. Wrote the prototype in Claude Code, partnered with the platform architect on scope decomposition (three business epics: UI, rules, deployment), and handed engineering a delivery-ready package they built directly against.</w:t>
+        <w:t>, prototyped in Claude Code and scoped with the platform architect, projected to cut ~30% from a ticket-gated enterprise workflow.</w:t>
       </w:r>
     </w:p>
     <w:p>
@@ -304,7 +304,7 @@
           <w:b/>
           <w:i w:val="0"/>
         </w:rPr>
-        <w:t xml:space="preserve">Surfaced ~$50M in at-risk ARR requiring intervention </w:t>
+        <w:t xml:space="preserve">Owned the upgrade program's data products </w:t>
       </w:r>
       <w:r>
         <w:rPr>
@@ -312,53 +312,7 @@
           <w:b w:val="0"/>
           <w:i w:val="0"/>
         </w:rPr>
-        <w:t>via a composite risk model for the top accounts in the enterprise upgrade program; replaced raw ticket counts with weighted signal across exposure, case volume, true-defect rate, and Salesforce sentiment. Automated the weekly reporting cadence the program lead acted on.</w:t>
-      </w:r>
-    </w:p>
-    <w:p>
-      <w:pPr>
-        <w:pStyle w:val="ListBullet"/>
-        <w:spacing w:before="0" w:after="60"/>
-        <w:ind w:left="360"/>
-      </w:pPr>
-      <w:r>
-        <w:rPr>
-          <w:rFonts w:ascii="Calibri" w:hAnsi="Calibri"/>
-          <w:b/>
-          <w:i w:val="0"/>
-        </w:rPr>
-        <w:t xml:space="preserve">Cut a working defect list ~97% (from ~200 issues to 5) </w:t>
-      </w:r>
-      <w:r>
-        <w:rPr>
-          <w:rFonts w:ascii="Calibri" w:hAnsi="Calibri"/>
-          <w:b w:val="0"/>
-          <w:i w:val="0"/>
-        </w:rPr>
-        <w:t>through an opinionated analytics product with a Claude Code function embedded as a first-class feature, routing the single highest-leverage action per panel across four products and five issue types.</w:t>
-      </w:r>
-    </w:p>
-    <w:p>
-      <w:pPr>
-        <w:pStyle w:val="ListBullet"/>
-        <w:spacing w:before="0" w:after="60"/>
-        <w:ind w:left="360"/>
-      </w:pPr>
-      <w:r>
-        <w:rPr>
-          <w:rFonts w:ascii="Calibri" w:hAnsi="Calibri"/>
-          <w:b/>
-          <w:i w:val="0"/>
-        </w:rPr>
-        <w:t xml:space="preserve">Drove cross-functional prioritization across product, engineering, and services in executive escalation rooms </w:t>
-      </w:r>
-      <w:r>
-        <w:rPr>
-          <w:rFonts w:ascii="Calibri" w:hAnsi="Calibri"/>
-          <w:b w:val="0"/>
-          <w:i w:val="0"/>
-        </w:rPr>
-        <w:t>for a $250M ARR platform serving 300 enterprise customers, translating real customer signal into tradeoff decisions across four product lines without direct authority.</w:t>
+        <w:t>— a composite ARR-risk model that surfaced ~$50M at risk before escalation, and an analytics product with an embedded Claude Code function that cut a defect list ~97%.</w:t>
       </w:r>
     </w:p>
     <w:p>
@@ -371,7 +325,7 @@
           <w:b w:val="0"/>
           <w:i/>
         </w:rPr>
-        <w:t>Brand Champion, UKG North America Regional Lead 2026. Fire Up ERG (women and allies), Business Innovation workstream lead. Designed delivery-health instrumentation across two engineering teams (15-minute refresh, documented anti-pattern criteria for burndown, velocity, story points).</w:t>
+        <w:t>Drove cross-functional prioritization in executive escalation rooms across four product lines. Brand Champion, UKG North America Regional Lead 2026; Fire Up ERG (women and allies), Business Innovation workstream lead.</w:t>
       </w:r>
     </w:p>
     <w:p>
@@ -428,7 +382,7 @@
           <w:b w:val="0"/>
           <w:i w:val="0"/>
         </w:rPr>
-        <w:t>in a regulated environment where a wrong output had regulatory consequence, not a bug ticket. Partnered with engineering on system behavior, data flows, integration dependencies, and technical tradeoffs.</w:t>
+        <w:t>in a regulated environment where a wrong output had regulatory consequence, not a bug ticket; partnered with engineering on system behavior, data flows, and integration dependencies.</w:t>
       </w:r>
     </w:p>
     <w:p>
@@ -520,7 +474,7 @@
           <w:b w:val="0"/>
           <w:i w:val="0"/>
         </w:rPr>
-        <w:t>Principal Product Manager-scope ownership, two-to-three-year product vision, OKR-to-execution, roadmap and prioritization in ambiguous spaces, cross-functional leadership without direct authority, mentorship of junior PMs, recognized subject-matter expert, outcomes over output, Agile / Scrum, B2B SaaS</w:t>
+        <w:t>Principal Product Manager-scope ownership, product vision and roadmap, OKR-to-execution, prioritization in ambiguous spaces, cross-functional leadership without direct authority, mentorship of junior PMs, outcomes over output, Agile / Scrum, B2B SaaS</w:t>
       </w:r>
     </w:p>
     <w:p>
@@ -541,7 +495,7 @@
           <w:b w:val="0"/>
           <w:i w:val="0"/>
         </w:rPr>
-        <w:t>AI capability platform building, embedded AI features inside internal products, Claude Code prototyping, twenty custom slash commands and a personal Claude Code productivity OS in active daily use, agentic workflows, responsible and customer-centric AI judgment, AI adoption measurement (extinction-over-addition, the fallback principle)</w:t>
+        <w:t>AI capability platform building, embedded AI features inside internal products, Claude Code prototyping, twenty custom slash commands and a personal Claude Code productivity OS in active daily use, agentic workflows, AI adoption measurement (extinction over addition)</w:t>
       </w:r>
     </w:p>
     <w:p>
@@ -562,7 +516,7 @@
           <w:b w:val="0"/>
           <w:i w:val="0"/>
         </w:rPr>
-        <w:t>APIs and system architecture, data flows and integration dependencies, deployment-model and platform product thinking, technical-systems fluency with engineering, requirements engineering, SQL</w:t>
+        <w:t>APIs and system architecture, data flows and integration dependencies, deployment-model and platform product thinking, technical-systems fluency with engineering, SQL</w:t>
       </w:r>
     </w:p>
     <w:p>
@@ -583,7 +537,7 @@
           <w:b w:val="0"/>
           <w:i w:val="0"/>
         </w:rPr>
-        <w:t>Opinionated analytics products, composite scoring and risk modeling, success-metric and KPI definition, hypothesis-driven development, qualitative-to-structured synthesis, signal-versus-noise routing</w:t>
+        <w:t>Opinionated analytics products, composite scoring and risk modeling, success-metric and KPI definition, hypothesis-driven development, signal-versus-noise routing</w:t>
       </w:r>
     </w:p>
     <w:p>
@@ -604,7 +558,7 @@
           <w:b w:val="0"/>
           <w:i w:val="0"/>
         </w:rPr>
-        <w:t>Compliance-grade regulated delivery, client confidentiality as table stakes, enterprise customer escalation-room presence, multi-org program coordination, executive synthesis, stakeholder management</w:t>
+        <w:t>Compliance-grade regulated delivery, client confidentiality as table stakes, enterprise customer escalation-room presence, multi-org program coordination, stakeholder management</w:t>
       </w:r>
     </w:p>
     <w:p>
@@ -713,7 +667,7 @@
           <w:b w:val="0"/>
           <w:i w:val="0"/>
         </w:rPr>
-        <w:t>Weekly publication on where AI actually earns its place, adoption realism, and what's happening beneath the surface of how teams work. Originator of the Zero-Translation Building framework. Active LinkedIn audience engagement on product strategy, AI adoption, and team dynamics.</w:t>
+        <w:t>Weekly publication on where AI actually earns its place, adoption realism, and what's happening beneath the surface of how teams work. Originator of the Zero-Translation Building framework.</w:t>
       </w:r>
     </w:p>
     <w:sectPr>

</xml_diff>